<commit_message>
fix: 修复 docxtpl 模板渲染语法错误 (Encountered unknown tag tr)
</commit_message>
<xml_diff>
--- a/dji_command_root/templates/report_template.docx
+++ b/dji_command_root/templates/report_template.docx
@@ -175,7 +175,9 @@
           </w:tcPr>
           <w:p>
             <w:r>
-              <w:t>{% tr for item in anomalies %}{{ loop.index }}</w:t>
+              <w:t>{% tr for item in anomalies %}</w:t>
+              <w:br/>
+              <w:t>{{ loop.index }}</w:t>
             </w:r>
           </w:p>
         </w:tc>
@@ -215,7 +217,9 @@
           </w:tcPr>
           <w:p>
             <w:r>
-              <w:t>{{ item.longitude }}, {{ item.latitude }}{% tr endfor %}</w:t>
+              <w:t>{{ item.longitude }}, {{ item.latitude }}</w:t>
+              <w:br/>
+              <w:t>{% tr endfor %}</w:t>
             </w:r>
           </w:p>
         </w:tc>

</xml_diff>

<commit_message>
fix: 放弃 {% tr %} 写法，使用标准的 Jinja2 {% for %} 语法解决 TemplateSyntaxError
</commit_message>
<xml_diff>
--- a/dji_command_root/templates/report_template.docx
+++ b/dji_command_root/templates/report_template.docx
@@ -175,7 +175,7 @@
           </w:tcPr>
           <w:p>
             <w:r>
-              <w:t>{% tr for item in anomalies %}</w:t>
+              <w:t>{% for item in anomalies %}</w:t>
               <w:br/>
               <w:t>{{ loop.index }}</w:t>
             </w:r>
@@ -219,7 +219,7 @@
             <w:r>
               <w:t>{{ item.longitude }}, {{ item.latitude }}</w:t>
               <w:br/>
-              <w:t>{% tr endfor %}</w:t>
+              <w:t>{% endfor %}</w:t>
             </w:r>
           </w:p>
         </w:tc>

</xml_diff>